<commit_message>
Partially review and applied proposed changes to first set
</commit_message>
<xml_diff>
--- a/Filings/Discovery/FirstSetDiscovey/Plaintiffs_First_Set_of_Requests_for_Production_to_FIE.docx
+++ b/Filings/Discovery/FirstSetDiscovey/Plaintiffs_First_Set_of_Requests_for_Production_to_FIE.docx
@@ -540,7 +540,7 @@
         <w:t xml:space="preserve">1.  </w:t>
       </w:r>
       <w:r>
-        <w:t xml:space="preserve">Time period. Unless a particular request specifies otherwise, each request covers the period January 1, 2020 through the present.</w:t>
+        <w:t>Time period. Unless a particular request specifies otherwise, each request covers the period January 1, 2020 through the present, except that as to The Policy, the underwriting file for The Policy, and all claims made at The Property before The Claim, each request covers the period October 22, 2014 through the present.</w:t>
       </w:r>
     </w:p>
     <w:p>
@@ -600,7 +600,7 @@
         <w:t xml:space="preserve">5.  </w:t>
       </w:r>
       <w:r>
-        <w:t xml:space="preserve">Form of production of ESI. Produce electronically stored information in its native format with all metadata intact, or in another reasonably usable form as the parties may agree; do not degrade the searchability of any ESI.</w:t>
+        <w:t>Form of production of ESI. Produce electronically stored information in its native format with all metadata intact, or in another reasonably usable form as the parties may agree; do not degrade the searchability of any ESI. Photographic image files, including all photographs taken at any inspection of The Property, shall be produced as the original image files with EXIF and all other embedded metadata intact and with original file names, and shall not be printed to image, flattened, converted, or re-compressed.</w:t>
       </w:r>
     </w:p>
     <w:p>
@@ -631,6 +631,66 @@
       </w:r>
       <w:r>
         <w:t xml:space="preserve">Construction. The words "and" and "or" are both conjunctive and disjunctive; "each" includes "every"; and the singular includes the plural and vice versa, as necessary to bring within the scope of each request all documents that might otherwise be construed to be outside its scope.</w:t>
+      </w:r>
+    </w:p>
+    <w:p>
+      <w:pPr>
+        <w:spacing w:after="160" w:line="276"/>
+      </w:pPr>
+      <w:r>
+        <w:rPr>
+          <w:b/>
+          <w:bCs/>
+        </w:rPr>
+        <w:t xml:space="preserve">8.  </w:t>
+      </w:r>
+      <w:r>
+        <w:t>Attorney-client communications and litigation counsel. No request seeks any document protected by the attorney-client privilege or by Minn. R. Civ. P. 26.02(d). Communications solely between You and Your counsel of record in this action, dated on or after July 8, 2026, need not be produced or included on any privilege log. This paragraph does not excuse the production or logging of any document created before that date, including documents created in the handling, investigation, evaluation, or denial of The Claim.</w:t>
+      </w:r>
+    </w:p>
+    <w:p>
+      <w:pPr>
+        <w:spacing w:after="160" w:line="276"/>
+      </w:pPr>
+      <w:r>
+        <w:rPr>
+          <w:b/>
+          <w:bCs/>
+        </w:rPr>
+        <w:t xml:space="preserve">9.  </w:t>
+      </w:r>
+      <w:r>
+        <w:t>Partial objections. If You object to any part of a request, produce all documents responsive to the remainder. As Minn. R. Civ. P. 34.02 requires, each objection must state whether any responsive materials are being withheld on the basis of that objection.</w:t>
+      </w:r>
+    </w:p>
+    <w:p>
+      <w:pPr>
+        <w:spacing w:after="160" w:line="276"/>
+      </w:pPr>
+      <w:r>
+        <w:rPr>
+          <w:b/>
+          <w:bCs/>
+        </w:rPr>
+        <w:t xml:space="preserve">10.  </w:t>
+      </w:r>
+      <w:r>
+        <w:t>Possession, custody, or control. Each request seeks documents in Your possession, custody, or control, which includes documents held by any person or entity from whom You have the practical ability to obtain them. If You contend that a responsive document is not within Your possession, custody, or control, identify the document by type, date, author, and subject matter, and identify the person who has it.</w:t>
+      </w:r>
+    </w:p>
+    <w:p>
+      <w:pPr>
+        <w:spacing w:after="160" w:line="276"/>
+      </w:pPr>
+      <w:r>
+        <w:rPr>
+          <w:b/>
+          <w:bCs/>
+        </w:rPr>
+        <w:t xml:space="preserve">11.  </w:t>
+      </w:r>
+      <w:r>
+        <w:t>Duplicative documents. A document responsive to more than one request need be produced only once, provided the production identifies each request to which it responds.</w:t>
       </w:r>
     </w:p>
     <w:p>
@@ -704,7 +764,7 @@
         <w:t xml:space="preserve">REQUEST FOR PRODUCTION NO. 4:  </w:t>
       </w:r>
       <w:r>
-        <w:t xml:space="preserve">All workproduct of Hancock Claims Consultants relating to the August 29, 2024 inspection of The Property, including the narrative report, field notes, measurement sheets, the complete systematic photograph set, all communications between Hancock and Farmers, all internal Hancock communications, billing records, and the Hancock retention agreement.</w:t>
+        <w:t>All documents in Your possession, custody, or control constituting, reflecting, or relating to the work of Hancock Claims Consultants on The Claim, including the narrative report, all field notes, measurement sheets, inspection-application data, and the complete photograph set produced in native form; all communications between Hancock and You; Hancock's billing records and invoices; and the retention agreement, statement of work, or service agreement under which Hancock was engaged. If You contend any responsive document is not within Your possession, custody, or control, identify it and identify the person who has it.</w:t>
       </w:r>
     </w:p>
     <w:p>
@@ -719,7 +779,7 @@
         <w:t xml:space="preserve">REQUEST FOR PRODUCTION NO. 5:  </w:t>
       </w:r>
       <w:r>
-        <w:t>The complete Prieve Engineering file for File #241008, including the engagement letter, retainer, statement or scope of work, billing records, field notes from the October 9, 2024 inspection, all drafts of the report and the final report, all peer reviews, and all communications between Prieve and You (including any comments on, or instructions to revise, any draft), and any impact-force, terminal-velocity, hail-size-threshold, or other engineering calculations, analyses, models, or worksheets underlying the report’s conclusions.</w:t>
+        <w:t>All documents in Your possession, custody, or control constituting, reflecting, or relating to Prieve Engineering, LLC File #241008, including the engagement letter, retainer, and statement or scope of work; billing records and invoices; field notes from the October 9, 2024 inspection; every draft of the report and the final report; all peer reviews; all communications between Prieve and You, including any comment on, or instruction to revise, any draft; and any impact-force, terminal-velocity, hail-size-threshold, or other engineering calculation, analysis, model, or worksheet underlying the report's conclusions. If You contend any responsive document is not within Your possession, custody, or control, identify it and identify the person who has it.</w:t>
       </w:r>
     </w:p>
     <w:p>
@@ -779,7 +839,7 @@
         <w:t xml:space="preserve">REQUEST FOR PRODUCTION NO. 9:  </w:t>
       </w:r>
       <w:r>
-        <w:t>All retention agreements between You (or any Farmers affiliate) and Prieve Engineering for Minnesota claims from January 1, 2020 forward, with the file number and claim number for each engagement, together with documents sufficient to identify, for each such engagement, the type of loss and the causation finding reached.</w:t>
+        <w:t>Documents sufficient to show, for each Minnesota residential property claim involving hail on which You or any Farmers affiliate engaged Prieve Engineering, LLC from January 1, 2020 through the present: the date of the engagement, the Prieve file number, the scope of work assigned, the amount paid to Prieve, and the causation conclusion Prieve reached. This request does not seek the underlying claim files, and Plaintiffs will agree that any production under this request be made subject to a protective order and with the names and addresses of other insureds redacted.</w:t>
       </w:r>
     </w:p>
     <w:p>
@@ -884,7 +944,7 @@
         <w:t xml:space="preserve">REQUEST FOR PRODUCTION NO. 16:  </w:t>
       </w:r>
       <w:r>
-        <w:t xml:space="preserve">The complete working file of umpire Wade Roos for the September 12, 2025 appraisal, including notes, calculations, photographs, measurements, drafts, and communications.</w:t>
+        <w:t>All documents in Your possession, custody, or control that You sent to or received from umpire Wade Roos, or that constitute any portion of his working file for the September 12, 2025 appraisal, including notes, calculations, photographs, measurements, drafts, worksheets, invoices, and communications. If You possess no report, estimate, worksheet, calculation, or methodology document from Mr. Roos supporting the $12,800 Replacement Cost Value or the $6,400 Actual Cash Value, state that expressly in Your response.</w:t>
       </w:r>
     </w:p>
     <w:p>
@@ -899,7 +959,7 @@
         <w:t xml:space="preserve">REQUEST FOR PRODUCTION NO. 17:  </w:t>
       </w:r>
       <w:r>
-        <w:t xml:space="preserve">The complete appraiser file of Greg Tomes, including notes, photographs, measurements, methodology, billing records, and any document reflecting his reasons for not signing The Appraisal Award.</w:t>
+        <w:t>All documents in Your possession, custody, or control constituting or relating to the appraiser file of Greg Tomes, including his notes, photographs, measurements, methodology, drafts, invoices, and billing records; all communications between You and Mr. Tomes concerning The Claim or the appraisal, including all communications concerning the scope of the appraisal and the items to be evaluated; the agreement or engagement under which he was appointed; and all documents reflecting his reasons for not signing The Appraisal Award. If You contend any responsive document is not within Your possession, custody, or control, identify it and identify the person who has it.</w:t>
       </w:r>
     </w:p>
     <w:p>
@@ -1123,17 +1183,6 @@
       </w:r>
       <w:r>
         <w:t>All documents reflecting Your review, evaluation, approval, or adoption of the Hancock Claims Consultants and Prieve Engineering reports in The Claim, including internal review notes, checklists, sign-offs, and communications.</w:t>
-      </w:r>
-    </w:p>
-    <w:p>
-      <w:pPr>
-        <w:spacing w:after="160" w:before="0" w:line="240" w:lineRule="auto"/>
-      </w:pPr>
-      <w:r>
-        <w:rPr>
-          <w:i/>
-        </w:rPr>
-        <w:t>[ Optional — delete this note before serving. The following request seeks vendor-pattern discovery and may draw an overbreadth objection; serve it only if you choose to pursue vendor-bias discovery, or narrow it to Minnesota hail claims. ]</w:t>
       </w:r>
     </w:p>
     <w:p>
@@ -1264,7 +1313,7 @@
         <w:t xml:space="preserve">Plaintiffs’ First Set of Requests for Production of Documents to Defendant Fire Insurance Exchange</w:t>
       </w:r>
       <w:r>
-        <w:t xml:space="preserve"> was served upon Defendant, through its attorney of record (or upon Defendant directly if no attorney has appeared), by ______________ [e-service through the Minnesota eFS system / email / U.S. Mail], at ______________, in accordance with Minn. R. Civ. P. 5. These discovery requests are served, not filed, in accordance with Minn. R. Civ. P. 5.04.</w:t>
+        <w:t xml:space="preserve"> was served upon Defendant, through its attorney of record (or upon Defendant directly if no attorney has appeared), by ______________ [e-service through the Minnesota eFS system / email / U.S. Mail], at ______________, in accordance with Minn. R. Civ. P. 5. These discovery requests are served, not filed, in accordance with Minn. R. Civ. P. 5.04(b).</w:t>
       </w:r>
     </w:p>
     <w:p>

</xml_diff>

<commit_message>
More review/updates for first set request for doc production
</commit_message>
<xml_diff>
--- a/Filings/Discovery/FirstSetDiscovey/Plaintiffs_First_Set_of_Requests_for_Production_to_FIE.docx
+++ b/Filings/Discovery/FirstSetDiscovey/Plaintiffs_First_Set_of_Requests_for_Production_to_FIE.docx
@@ -764,7 +764,7 @@
         <w:t xml:space="preserve">REQUEST FOR PRODUCTION NO. 4:  </w:t>
       </w:r>
       <w:r>
-        <w:t>All documents in Your possession, custody, or control constituting, reflecting, or relating to the work of Hancock Claims Consultants on The Claim, including the narrative report, all field notes, measurement sheets, inspection-application data, and the complete photograph set produced in native form; all communications between Hancock and You; Hancock's billing records and invoices; and the retention agreement, statement of work, or service agreement under which Hancock was engaged. If You contend any responsive document is not within Your possession, custody, or control, identify it and identify the person who has it.</w:t>
+        <w:t>All documents in Your possession, custody, or control constituting, reflecting, or relating to the work of Hancock Claims Consultants on The Claim, including the narrative report, all field notes, measurement sheets, inspection-application data, and the complete photograph set produced in native form; all communications between Hancock and You; Hancock's billing records and invoices; and the retention agreement, statement of work, or service agreement under which Hancock was engaged. If You contend any responsive document is not within Your possession, custody, or control, identify it and identify the person who has it. Plaintiffs contend that documents held by Hancock Claims Consultants in connection with its engagement by You are within Your possession, custody, or control within the meaning of Minn. R. Civ. P. 34.01. If You disagree, state the basis for that position and produce the retention agreement, engagement letter, and service agreement governing Your access to those documents.</w:t>
       </w:r>
     </w:p>
     <w:p>
@@ -779,7 +779,7 @@
         <w:t xml:space="preserve">REQUEST FOR PRODUCTION NO. 5:  </w:t>
       </w:r>
       <w:r>
-        <w:t>All documents in Your possession, custody, or control constituting, reflecting, or relating to Prieve Engineering, LLC File #241008, including the engagement letter, retainer, and statement or scope of work; billing records and invoices; field notes from the October 9, 2024 inspection; every draft of the report and the final report; all peer reviews; all communications between Prieve and You, including any comment on, or instruction to revise, any draft; and any impact-force, terminal-velocity, hail-size-threshold, or other engineering calculation, analysis, model, or worksheet underlying the report's conclusions. If You contend any responsive document is not within Your possession, custody, or control, identify it and identify the person who has it.</w:t>
+        <w:t>All documents in Your possession, custody, or control constituting, reflecting, or relating to Prieve Engineering, LLC File #241008, including the engagement letter, retainer, and statement or scope of work; billing records and invoices; field notes from the October 9, 2024 inspection; every draft of the report and the final report; all peer reviews; all communications between Prieve and You, including any comment on, or instruction to revise, any draft; and any impact-force, terminal-velocity, hail-size-threshold, or other engineering calculation, analysis, model, or worksheet underlying the report's conclusions. If You contend any responsive document is not within Your possession, custody, or control, identify it and identify the person who has it. Plaintiffs contend that documents held by Prieve Engineering, LLC in connection with its engagement by You are within Your possession, custody, or control within the meaning of Minn. R. Civ. P. 34.01. If You disagree, state the basis for that position and produce the retention agreement, engagement letter, and service agreement governing Your access to those documents.</w:t>
       </w:r>
     </w:p>
     <w:p>
@@ -884,7 +884,7 @@
         <w:t xml:space="preserve">REQUEST FOR PRODUCTION NO. 12:  </w:t>
       </w:r>
       <w:r>
-        <w:t xml:space="preserve">Any log or record reflecting the acceptance or rejection of non-engineer evidence on hail claims; if no such log exists, all communications evidencing that practice.</w:t>
+        <w:t>Any log, report, tracking record, or database entry reflecting the acceptance or rejection of evidence not prepared by a licensed engineer on Minnesota hail claims from January 1, 2023 through the present.</w:t>
       </w:r>
     </w:p>
     <w:p>
@@ -914,7 +914,7 @@
         <w:t xml:space="preserve">REQUEST FOR PRODUCTION NO. 14:  </w:t>
       </w:r>
       <w:r>
-        <w:t xml:space="preserve">Your litigation-hold notice for this matter, including the date of issuance, the recipients, the categories of material preserved, and all updates.</w:t>
+        <w:t>Documents sufficient to show the date on which any litigation hold, preservation notice, or document-preservation instruction concerning The Claim or this action was issued, the persons to whom it was directed, the categories of documents and data it directed to be preserved, and the date and substance of each update to it. Plaintiffs do not by this request seek the text of any communication from counsel, and expressly reserve the right to seek the notice itself upon a showing that responsive documents have been lost or destroyed.</w:t>
       </w:r>
     </w:p>
     <w:p>
@@ -959,7 +959,7 @@
         <w:t xml:space="preserve">REQUEST FOR PRODUCTION NO. 17:  </w:t>
       </w:r>
       <w:r>
-        <w:t>All documents in Your possession, custody, or control constituting or relating to the appraiser file of Greg Tomes, including his notes, photographs, measurements, methodology, drafts, invoices, and billing records; all communications between You and Mr. Tomes concerning The Claim or the appraisal, including all communications concerning the scope of the appraisal and the items to be evaluated; the agreement or engagement under which he was appointed; and all documents reflecting his reasons for not signing The Appraisal Award. If You contend any responsive document is not within Your possession, custody, or control, identify it and identify the person who has it.</w:t>
+        <w:t>All documents in Your possession, custody, or control constituting or relating to the appraiser file of Greg Tomes, including his notes, photographs, measurements, methodology, drafts, invoices, and billing records; all communications between You and Mr. Tomes concerning The Claim or the appraisal, including all communications concerning the scope of the appraisal and the items to be evaluated; the agreement or engagement under which he was appointed; and all documents reflecting his reasons for not signing The Appraisal Award. If You contend any responsive document is not within Your possession, custody, or control, identify it and identify the person who has it. Plaintiffs contend that documents held by Greg Tomes in connection with his appointment as Your appraiser are within Your possession, custody, or control within the meaning of Minn. R. Civ. P. 34.01. If You disagree, state the basis for that position and produce the retention agreement, engagement letter, appointment documents, and any service or fee agreement governing Your access to those documents.</w:t>
       </w:r>
     </w:p>
     <w:p>
@@ -1019,7 +1019,7 @@
         <w:t xml:space="preserve">REQUEST FOR PRODUCTION NO. 21:  </w:t>
       </w:r>
       <w:r>
-        <w:t xml:space="preserve">The complete audit trail for The Claim file, including every entry, edit, deletion, or supplementation, with the timestamp and user for each.</w:t>
+        <w:t>The complete audit trail for The Claim file, including every entry, edit, deletion, or supplementation, with the timestamp and user for each, together with documents sufficient to describe the audit-logging, versioning, and deletion-tracking capabilities of each system in which The Claim was maintained, and the retention period applicable to those logs.</w:t>
       </w:r>
     </w:p>
     <w:p>
@@ -1124,7 +1124,7 @@
         <w:t xml:space="preserve">REQUEST FOR PRODUCTION NO. 28:  </w:t>
       </w:r>
       <w:r>
-        <w:t>All documents identifying Hancock Claims Consultants’ Minnesota engagements from January 1, 2020 forward, including retention agreements and file lists, and documents sufficient to identify the outcome of each such engagement.</w:t>
+        <w:t>Documents sufficient to show, for each Minnesota residential property claim involving hail on which You or any Farmers affiliate engaged Hancock Claims Consultants from January 1, 2020 through the present: the date of the engagement, the scope of work assigned, the amount paid, and whether the inspection reported damage. This request does not seek the underlying claim files, and Plaintiffs will agree that any production be made subject to a protective order and with the names and addresses of other insureds redacted.</w:t>
       </w:r>
     </w:p>
     <w:p>
@@ -1197,6 +1197,136 @@
       </w:r>
       <w:r>
         <w:t>All vendor-management, selection, oversight, performance-evaluation, and service-agreement documents concerning Hancock Claims Consultants and Prieve Engineering, LLC from January 1, 2020 forward, including documents reflecting the volume of assignments to, and payments made to, each.</w:t>
+      </w:r>
+    </w:p>
+    <w:p>
+      <w:pPr>
+        <w:spacing w:after="160" w:before="0" w:line="240" w:lineRule="auto"/>
+      </w:pPr>
+      <w:r>
+        <w:rPr>
+          <w:b/>
+        </w:rPr>
+        <w:t xml:space="preserve">REQUEST FOR PRODUCTION NO. 34:  </w:t>
+      </w:r>
+      <w:r>
+        <w:rPr/>
+        <w:t>All estimates prepared, received, or reviewed by You in connection with The Claim or The 2020 Claim, produced in native format with the estimate identifier, price-list version, and revision history intact; all documents stating or reflecting Your methodology for calculating actual cash value and depreciation on losses to windows, siding, and exterior components, including depreciation schedules, useful-life tables, and any condition or age adjustment applied; all documents showing the derivation of the $6,400 Actual Cash Value stated in The Appraisal Award, including any worksheet, calculation, or communication allocating that figure between the awarded windows; and the Xactimate or other estimating-platform price lists for Hennepin County, Minnesota in effect from July 2024 through the present.</w:t>
+      </w:r>
+    </w:p>
+    <w:p>
+      <w:pPr>
+        <w:spacing w:after="160" w:before="0" w:line="240" w:lineRule="auto"/>
+      </w:pPr>
+      <w:r>
+        <w:rPr>
+          <w:b/>
+        </w:rPr>
+        <w:t xml:space="preserve">REQUEST FOR PRODUCTION NO. 35:  </w:t>
+      </w:r>
+      <w:r>
+        <w:rPr/>
+        <w:t>The complete underwriting file for Policy 98055-49-65 from application through the October 22, 2023 renewal, including the application and all supporting materials; all underwriting, renewal, or loss-control inspections of The Property and all photographs taken in connection with them; all underwriting guidelines applied to The Property; all documents reflecting the condition of The Property as recorded by You at any time before July 13, 2024; and all documents evidencing the attorney-in-fact relationship between Fire Insurance Exchange and Fire Underwriters Association, including the subscription agreement and power of attorney applicable to Policy 98055-49-65.</w:t>
+      </w:r>
+    </w:p>
+    <w:p>
+      <w:pPr>
+        <w:spacing w:after="160" w:before="0" w:line="240" w:lineRule="auto"/>
+      </w:pPr>
+      <w:r>
+        <w:rPr>
+          <w:b/>
+        </w:rPr>
+        <w:t xml:space="preserve">REQUEST FOR PRODUCTION NO. 36:  </w:t>
+      </w:r>
+      <w:r>
+        <w:rPr/>
+        <w:t>The Declarations page for Policy 98055-49-65 in force on July 13, 2024; the complete policy, including all forms and endorsements, as delivered to Plaintiffs at the October 22, 2023 renewal; all documents evidencing delivery of the policy and of any endorsement to Plaintiffs; and all documents showing the Coverage A limit in force on July 13, 2024, the calculation of the $17,720 windstorm and hail deductible, and the manner in which that deductible applies to a loss under The Policy.</w:t>
+      </w:r>
+    </w:p>
+    <w:p>
+      <w:pPr>
+        <w:spacing w:after="160" w:before="0" w:line="240" w:lineRule="auto"/>
+      </w:pPr>
+      <w:r>
+        <w:rPr>
+          <w:b/>
+        </w:rPr>
+        <w:t xml:space="preserve">REQUEST FOR PRODUCTION NO. 37:  </w:t>
+      </w:r>
+      <w:r>
+        <w:rPr/>
+        <w:t>All audio recordings, voicemail messages, transcripts, call notes, and telephone logs relating to The Claim or The 2020 Claim, including the February 3, 2025 telephone call between Bradlee Monson and Yibiao Lu and the February 10, 2025 voicemail from Nicholas Brau, together with all documents stating Your retention policy for call recordings, voicemail messages, and telephone logs.</w:t>
+      </w:r>
+    </w:p>
+    <w:p>
+      <w:pPr>
+        <w:spacing w:after="160" w:before="0" w:line="240" w:lineRule="auto"/>
+      </w:pPr>
+      <w:r>
+        <w:rPr>
+          <w:b/>
+        </w:rPr>
+        <w:t xml:space="preserve">REQUEST FOR PRODUCTION NO. 38:  </w:t>
+      </w:r>
+      <w:r>
+        <w:rPr/>
+        <w:t>All documents You contend support (a) each affirmative defense asserted in Your Answer; (b) each denial of an allegation of the Complaint; and (c) any contention that hail did not cause damage to any window or exterior component of The Property beyond the windows designated "F 1.7" and "B 1.2" in The Appraisal Award. This request also seeks all documents described in, or responsive to, Your disclosures under Minn. R. Civ. P. 26.01(a).</w:t>
+      </w:r>
+    </w:p>
+    <w:p>
+      <w:pPr>
+        <w:spacing w:after="160" w:before="0" w:line="240" w:lineRule="auto"/>
+      </w:pPr>
+      <w:r>
+        <w:rPr>
+          <w:b/>
+        </w:rPr>
+        <w:t xml:space="preserve">REQUEST FOR PRODUCTION NO. 39:  </w:t>
+      </w:r>
+      <w:r>
+        <w:rPr/>
+        <w:t>All documents You contend establish that The Appraisal Award resolved The Claim, in whole or in part, including all documents identifying each window, sash, or exterior component that the appraisal panel evaluated and each that it did not evaluate; all documents reflecting the scope of the matters submitted to the panel; and all documents supporting Your Second Affirmative Defense.</w:t>
+      </w:r>
+    </w:p>
+    <w:p>
+      <w:pPr>
+        <w:spacing w:after="160" w:before="0" w:line="240" w:lineRule="auto"/>
+      </w:pPr>
+      <w:r>
+        <w:rPr>
+          <w:b/>
+        </w:rPr>
+        <w:t xml:space="preserve">REQUEST FOR PRODUCTION NO. 40:  </w:t>
+      </w:r>
+      <w:r>
+        <w:rPr/>
+        <w:t>All documents identifying, keying, indexing, or cross-referencing the window designations "F 1.7" and "B 1.2" used in The Appraisal Award, including any window inventory, code key, schedule, worksheet, photograph index, or estimate line-item list prepared or used by You, by Greg Tomes, by John Foster, by Wade Roos, by Pure Construction, or by any person acting on Your behalf, and all communications in which either designation appears.</w:t>
+      </w:r>
+    </w:p>
+    <w:p>
+      <w:pPr>
+        <w:spacing w:after="160" w:before="0" w:line="240" w:lineRule="auto"/>
+      </w:pPr>
+      <w:r>
+        <w:rPr>
+          <w:b/>
+        </w:rPr>
+        <w:t xml:space="preserve">REQUEST FOR PRODUCTION NO. 41:  </w:t>
+      </w:r>
+      <w:r>
+        <w:rPr/>
+        <w:t xml:space="preserve">All documents stating or reflecting Your interpretation, guidance, training, or claims-handling practice concerning Endorsement J6944 (Limited Matching of Undamaged Property) and concerning the matching obligation addressed in </w:t>
+      </w:r>
+      <w:r>
+        <w:rPr>
+          <w:i/>
+        </w:rPr>
+        <w:t>Cedar Bluff Townhome Condominium Ass'n v. American Family Mut. Ins. Co.</w:t>
+      </w:r>
+      <w:r>
+        <w:rPr/>
+        <w:t>, 857 N.W.2d 290 (Minn. 2014), as applied to Minnesota property claims, including any guidance concerning claims in which the original manufacturer of the damaged property has ceased production or the original product is no longer available.</w:t>
       </w:r>
     </w:p>
     <w:p>

</xml_diff>

<commit_message>
Move original request 33 to second set - "All vendor-management, selection, oversight, performance-evaluation, and service-agreement documents concerning Hancock Claims Consultants and Prieve Engineering, LLC from January 1, 2020 forward, including documents reflecting the volume of assignments to, and payments made to, each."
</commit_message>
<xml_diff>
--- a/Filings/Discovery/FirstSetDiscovey/Plaintiffs_First_Set_of_Requests_for_Production_to_FIE.docx
+++ b/Filings/Discovery/FirstSetDiscovey/Plaintiffs_First_Set_of_Requests_for_Production_to_FIE.docx
@@ -1196,20 +1196,6 @@
         <w:t xml:space="preserve">REQUEST FOR PRODUCTION NO. 33:  </w:t>
       </w:r>
       <w:r>
-        <w:t>All vendor-management, selection, oversight, performance-evaluation, and service-agreement documents concerning Hancock Claims Consultants and Prieve Engineering, LLC from January 1, 2020 forward, including documents reflecting the volume of assignments to, and payments made to, each.</w:t>
-      </w:r>
-    </w:p>
-    <w:p>
-      <w:pPr>
-        <w:spacing w:after="160" w:before="0" w:line="240" w:lineRule="auto"/>
-      </w:pPr>
-      <w:r>
-        <w:rPr>
-          <w:b/>
-        </w:rPr>
-        <w:t xml:space="preserve">REQUEST FOR PRODUCTION NO. 34:  </w:t>
-      </w:r>
-      <w:r>
         <w:rPr/>
         <w:t>All estimates prepared, received, or reviewed by You in connection with The Claim or The 2020 Claim, produced in native format with the estimate identifier, price-list version, and revision history intact; all documents stating or reflecting Your methodology for calculating actual cash value and depreciation on losses to windows, siding, and exterior components, including depreciation schedules, useful-life tables, and any condition or age adjustment applied; all documents showing the derivation of the $6,400 Actual Cash Value stated in The Appraisal Award, including any worksheet, calculation, or communication allocating that figure between the awarded windows; and the Xactimate or other estimating-platform price lists for Hennepin County, Minnesota in effect from July 2024 through the present.</w:t>
       </w:r>
@@ -1222,7 +1208,7 @@
         <w:rPr>
           <w:b/>
         </w:rPr>
-        <w:t xml:space="preserve">REQUEST FOR PRODUCTION NO. 35:  </w:t>
+        <w:t xml:space="preserve">REQUEST FOR PRODUCTION NO. 34:  </w:t>
       </w:r>
       <w:r>
         <w:rPr/>
@@ -1237,7 +1223,7 @@
         <w:rPr>
           <w:b/>
         </w:rPr>
-        <w:t xml:space="preserve">REQUEST FOR PRODUCTION NO. 36:  </w:t>
+        <w:t xml:space="preserve">REQUEST FOR PRODUCTION NO. 35:  </w:t>
       </w:r>
       <w:r>
         <w:rPr/>
@@ -1252,7 +1238,7 @@
         <w:rPr>
           <w:b/>
         </w:rPr>
-        <w:t xml:space="preserve">REQUEST FOR PRODUCTION NO. 37:  </w:t>
+        <w:t xml:space="preserve">REQUEST FOR PRODUCTION NO. 36:  </w:t>
       </w:r>
       <w:r>
         <w:rPr/>
@@ -1267,7 +1253,7 @@
         <w:rPr>
           <w:b/>
         </w:rPr>
-        <w:t xml:space="preserve">REQUEST FOR PRODUCTION NO. 38:  </w:t>
+        <w:t xml:space="preserve">REQUEST FOR PRODUCTION NO. 37:  </w:t>
       </w:r>
       <w:r>
         <w:rPr/>
@@ -1282,7 +1268,7 @@
         <w:rPr>
           <w:b/>
         </w:rPr>
-        <w:t xml:space="preserve">REQUEST FOR PRODUCTION NO. 39:  </w:t>
+        <w:t xml:space="preserve">REQUEST FOR PRODUCTION NO. 38:  </w:t>
       </w:r>
       <w:r>
         <w:rPr/>
@@ -1297,7 +1283,7 @@
         <w:rPr>
           <w:b/>
         </w:rPr>
-        <w:t xml:space="preserve">REQUEST FOR PRODUCTION NO. 40:  </w:t>
+        <w:t xml:space="preserve">REQUEST FOR PRODUCTION NO. 39:  </w:t>
       </w:r>
       <w:r>
         <w:rPr/>
@@ -1312,7 +1298,7 @@
         <w:rPr>
           <w:b/>
         </w:rPr>
-        <w:t xml:space="preserve">REQUEST FOR PRODUCTION NO. 41:  </w:t>
+        <w:t xml:space="preserve">REQUEST FOR PRODUCTION NO. 40:  </w:t>
       </w:r>
       <w:r>
         <w:rPr/>

</xml_diff>